<commit_message>
service location: fix docx photos rendering — isolate {%data} image tag in its own run so docxtemplater image module expands it
</commit_message>
<xml_diff>
--- a/public/templates/service-location.docx
+++ b/public/templates/service-location.docx
@@ -4626,7 +4626,13 @@
           <w:szCs w:val="20"/>
           <w:u w:val="none"/>
         </w:rPr>
-        <w:t>{#photos}{%data}{/photos}</w:t>
+        <w:t>{#photos}</w:t>
+      </w:r>
+      <w:r>
+        <w:t xml:space="preserve">{%data}</w:t>
+      </w:r>
+      <w:r>
+        <w:t xml:space="preserve">{/photos}</w:t>
       </w:r>
     </w:p>
     <w:p>

</xml_diff>

<commit_message>
service location: fix Add Note layout; add 'DBYD supplied by client' option that skips the DBYD table in the report and shows a note instead
</commit_message>
<xml_diff>
--- a/public/templates/service-location.docx
+++ b/public/templates/service-location.docx
@@ -2916,6 +2916,11 @@
         <w:t xml:space="preserve"> DETAILS (DBYD) </w:t>
       </w:r>
     </w:p>
+    <w:p>
+      <w:r>
+        <w:t>{^dbydByClient}</w:t>
+      </w:r>
+    </w:p>
     <w:tbl>
       <w:tblPr>
         <w:tblStyle w:val="ListTable4-Accent4"/>
@@ -3279,6 +3284,19 @@
         </w:tc>
       </w:tr>
     </w:tbl>
+    <w:p>
+      <w:r>
+        <w:t>{/dbydByClient}</w:t>
+      </w:r>
+    </w:p>
+    <w:p>
+      <w:r>
+        <w:rPr>
+          <w:b/>
+        </w:rPr>
+        <w:t xml:space="preserve">{#dbydByClient}DBYD to be supplied by client{/dbydByClient}</w:t>
+      </w:r>
+    </w:p>
     <w:p>
       <w:pPr>
         <w:tabs>

</xml_diff>

<commit_message>
fix(template): make Service Location docx convert cleanly to PDF
The only conversion-fragile elements were floating objects that
LibreOffice/Google reposition during docx->PDF:
- 6 floating "Straight Connector" decorative lines (absolute-positioned,
  wrapNone) -> removed.
- 3 floating (text-wrapped) tables -> un-floated by dropping w:tblpPr so
  they flow inline.

All 4 tables, the letterhead (headers/footers), and every docxtemplater
tag ({#photos}, {^dbydByClient}, {date}, ...) are preserved. Verified:
valid zip, well-formed XML, and a clean 200/PDF round-trip through the
converter. Original kept in git history; a local *.backup.docx is gitignored.
</commit_message>
<xml_diff>
--- a/public/templates/service-location.docx
+++ b/public/templates/service-location.docx
@@ -32,7 +32,6 @@
     <w:tbl>
       <w:tblPr>
         <w:tblStyle w:val="ListTable4-Accent4"/>
-        <w:tblpPr w:leftFromText="180" w:rightFromText="180" w:vertAnchor="text" w:horzAnchor="margin" w:tblpXSpec="center" w:tblpY="330"/>
         <w:tblW w:w="10940" w:type="dxa"/>
         <w:tblLook w:val="04A0" w:firstRow="1" w:lastRow="0" w:firstColumn="1" w:lastColumn="0" w:noHBand="0" w:noVBand="1"/>
       </w:tblPr>
@@ -602,71 +601,6 @@
           <w:szCs w:val="20"/>
           <w:u w:val="none"/>
         </w:rPr>
-        <mc:AlternateContent>
-          <mc:Choice Requires="wps">
-            <w:drawing>
-              <wp:anchor distT="0" distB="0" distL="114300" distR="114300" simplePos="0" relativeHeight="251659264" behindDoc="0" locked="0" layoutInCell="1" allowOverlap="1" wp14:anchorId="2DA3105A" wp14:editId="30246C73">
-                <wp:simplePos x="0" y="0"/>
-                <wp:positionH relativeFrom="column">
-                  <wp:posOffset>-271145</wp:posOffset>
-                </wp:positionH>
-                <wp:positionV relativeFrom="paragraph">
-                  <wp:posOffset>258445</wp:posOffset>
-                </wp:positionV>
-                <wp:extent cx="7010400" cy="0"/>
-                <wp:effectExtent l="0" t="19050" r="19050" b="19050"/>
-                <wp:wrapNone/>
-                <wp:docPr id="1773795089" name="Straight Connector 1"/>
-                <wp:cNvGraphicFramePr/>
-                <a:graphic xmlns:a="http://schemas.openxmlformats.org/drawingml/2006/main">
-                  <a:graphicData uri="http://schemas.microsoft.com/office/word/2010/wordprocessingShape">
-                    <wps:wsp>
-                      <wps:cNvCnPr/>
-                      <wps:spPr>
-                        <a:xfrm>
-                          <a:off x="0" y="0"/>
-                          <a:ext cx="7010400" cy="0"/>
-                        </a:xfrm>
-                        <a:prstGeom prst="line">
-                          <a:avLst/>
-                        </a:prstGeom>
-                        <a:ln w="28575"/>
-                      </wps:spPr>
-                      <wps:style>
-                        <a:lnRef idx="3">
-                          <a:schemeClr val="accent4"/>
-                        </a:lnRef>
-                        <a:fillRef idx="0">
-                          <a:schemeClr val="accent4"/>
-                        </a:fillRef>
-                        <a:effectRef idx="2">
-                          <a:schemeClr val="accent4"/>
-                        </a:effectRef>
-                        <a:fontRef idx="minor">
-                          <a:schemeClr val="tx1"/>
-                        </a:fontRef>
-                      </wps:style>
-                      <wps:bodyPr/>
-                    </wps:wsp>
-                  </a:graphicData>
-                </a:graphic>
-                <wp14:sizeRelH relativeFrom="margin">
-                  <wp14:pctWidth>0</wp14:pctWidth>
-                </wp14:sizeRelH>
-                <wp14:sizeRelV relativeFrom="margin">
-                  <wp14:pctHeight>0</wp14:pctHeight>
-                </wp14:sizeRelV>
-              </wp:anchor>
-            </w:drawing>
-          </mc:Choice>
-          <mc:Fallback>
-            <w:pict>
-              <v:line w14:anchorId="71164304" id="Straight Connector 1" o:spid="_x0000_s1026" style="position:absolute;z-index:251659264;visibility:visible;mso-wrap-style:square;mso-width-percent:0;mso-height-percent:0;mso-wrap-distance-left:9pt;mso-wrap-distance-top:0;mso-wrap-distance-right:9pt;mso-wrap-distance-bottom:0;mso-position-horizontal:absolute;mso-position-horizontal-relative:text;mso-position-vertical:absolute;mso-position-vertical-relative:text;mso-width-percent:0;mso-height-percent:0;mso-width-relative:margin;mso-height-relative:margin" from="-21.35pt,20.35pt" to="530.65pt,20.35pt" o:gfxdata="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" strokecolor="#ffc000 [3207]" strokeweight="2.25pt">
-                <v:stroke joinstyle="miter"/>
-              </v:line>
-            </w:pict>
-          </mc:Fallback>
-        </mc:AlternateContent>
       </w:r>
       <w:r>
         <w:rPr>
@@ -690,7 +624,6 @@
     </w:p>
     <w:tbl>
       <w:tblPr>
-        <w:tblpPr w:leftFromText="180" w:rightFromText="180" w:vertAnchor="text" w:horzAnchor="margin" w:tblpXSpec="center" w:tblpY="138"/>
         <w:tblW w:w="5453" w:type="pct"/>
         <w:tblCellMar>
           <w:left w:w="0" w:type="dxa"/>
@@ -2809,71 +2742,6 @@
           <w:szCs w:val="20"/>
           <w:u w:val="none"/>
         </w:rPr>
-        <mc:AlternateContent>
-          <mc:Choice Requires="wps">
-            <w:drawing>
-              <wp:anchor distT="0" distB="0" distL="114300" distR="114300" simplePos="0" relativeHeight="251661312" behindDoc="0" locked="0" layoutInCell="1" allowOverlap="1" wp14:anchorId="4FF59247" wp14:editId="7B18B096">
-                <wp:simplePos x="0" y="0"/>
-                <wp:positionH relativeFrom="column">
-                  <wp:posOffset>-271145</wp:posOffset>
-                </wp:positionH>
-                <wp:positionV relativeFrom="paragraph">
-                  <wp:posOffset>248920</wp:posOffset>
-                </wp:positionV>
-                <wp:extent cx="7010400" cy="0"/>
-                <wp:effectExtent l="0" t="19050" r="19050" b="19050"/>
-                <wp:wrapNone/>
-                <wp:docPr id="1013450028" name="Straight Connector 1"/>
-                <wp:cNvGraphicFramePr/>
-                <a:graphic xmlns:a="http://schemas.openxmlformats.org/drawingml/2006/main">
-                  <a:graphicData uri="http://schemas.microsoft.com/office/word/2010/wordprocessingShape">
-                    <wps:wsp>
-                      <wps:cNvCnPr/>
-                      <wps:spPr>
-                        <a:xfrm>
-                          <a:off x="0" y="0"/>
-                          <a:ext cx="7010400" cy="0"/>
-                        </a:xfrm>
-                        <a:prstGeom prst="line">
-                          <a:avLst/>
-                        </a:prstGeom>
-                        <a:ln w="28575"/>
-                      </wps:spPr>
-                      <wps:style>
-                        <a:lnRef idx="3">
-                          <a:schemeClr val="accent4"/>
-                        </a:lnRef>
-                        <a:fillRef idx="0">
-                          <a:schemeClr val="accent4"/>
-                        </a:fillRef>
-                        <a:effectRef idx="2">
-                          <a:schemeClr val="accent4"/>
-                        </a:effectRef>
-                        <a:fontRef idx="minor">
-                          <a:schemeClr val="tx1"/>
-                        </a:fontRef>
-                      </wps:style>
-                      <wps:bodyPr/>
-                    </wps:wsp>
-                  </a:graphicData>
-                </a:graphic>
-                <wp14:sizeRelH relativeFrom="margin">
-                  <wp14:pctWidth>0</wp14:pctWidth>
-                </wp14:sizeRelH>
-                <wp14:sizeRelV relativeFrom="margin">
-                  <wp14:pctHeight>0</wp14:pctHeight>
-                </wp14:sizeRelV>
-              </wp:anchor>
-            </w:drawing>
-          </mc:Choice>
-          <mc:Fallback>
-            <w:pict>
-              <v:line w14:anchorId="158F5B2A" id="Straight Connector 1" o:spid="_x0000_s1026" style="position:absolute;z-index:251661312;visibility:visible;mso-wrap-style:square;mso-width-percent:0;mso-height-percent:0;mso-wrap-distance-left:9pt;mso-wrap-distance-top:0;mso-wrap-distance-right:9pt;mso-wrap-distance-bottom:0;mso-position-horizontal:absolute;mso-position-horizontal-relative:text;mso-position-vertical:absolute;mso-position-vertical-relative:text;mso-width-percent:0;mso-height-percent:0;mso-width-relative:margin;mso-height-relative:margin" from="-21.35pt,19.6pt" to="530.65pt,19.6pt" o:gfxdata="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" strokecolor="#ffc000 [3207]" strokeweight="2.25pt">
-                <v:stroke joinstyle="miter"/>
-              </v:line>
-            </w:pict>
-          </mc:Fallback>
-        </mc:AlternateContent>
       </w:r>
       <w:r>
         <w:rPr>
@@ -2924,7 +2792,6 @@
     <w:tbl>
       <w:tblPr>
         <w:tblStyle w:val="ListTable4-Accent4"/>
-        <w:tblpPr w:leftFromText="180" w:rightFromText="180" w:vertAnchor="text" w:horzAnchor="margin" w:tblpXSpec="center" w:tblpY="296"/>
         <w:tblW w:w="10912" w:type="dxa"/>
         <w:tblLook w:val="04A0" w:firstRow="1" w:lastRow="0" w:firstColumn="1" w:lastColumn="0" w:noHBand="0" w:noVBand="1"/>
       </w:tblPr>
@@ -3376,71 +3243,6 @@
           <w:szCs w:val="20"/>
           <w:u w:val="none"/>
         </w:rPr>
-        <mc:AlternateContent>
-          <mc:Choice Requires="wps">
-            <w:drawing>
-              <wp:anchor distT="0" distB="0" distL="114300" distR="114300" simplePos="0" relativeHeight="251663360" behindDoc="0" locked="0" layoutInCell="1" allowOverlap="1" wp14:anchorId="4CA85B02" wp14:editId="79426A3A">
-                <wp:simplePos x="0" y="0"/>
-                <wp:positionH relativeFrom="column">
-                  <wp:posOffset>-271145</wp:posOffset>
-                </wp:positionH>
-                <wp:positionV relativeFrom="paragraph">
-                  <wp:posOffset>248920</wp:posOffset>
-                </wp:positionV>
-                <wp:extent cx="7010400" cy="0"/>
-                <wp:effectExtent l="0" t="19050" r="19050" b="19050"/>
-                <wp:wrapNone/>
-                <wp:docPr id="1221823085" name="Straight Connector 1"/>
-                <wp:cNvGraphicFramePr/>
-                <a:graphic xmlns:a="http://schemas.openxmlformats.org/drawingml/2006/main">
-                  <a:graphicData uri="http://schemas.microsoft.com/office/word/2010/wordprocessingShape">
-                    <wps:wsp>
-                      <wps:cNvCnPr/>
-                      <wps:spPr>
-                        <a:xfrm>
-                          <a:off x="0" y="0"/>
-                          <a:ext cx="7010400" cy="0"/>
-                        </a:xfrm>
-                        <a:prstGeom prst="line">
-                          <a:avLst/>
-                        </a:prstGeom>
-                        <a:ln w="28575"/>
-                      </wps:spPr>
-                      <wps:style>
-                        <a:lnRef idx="3">
-                          <a:schemeClr val="accent4"/>
-                        </a:lnRef>
-                        <a:fillRef idx="0">
-                          <a:schemeClr val="accent4"/>
-                        </a:fillRef>
-                        <a:effectRef idx="2">
-                          <a:schemeClr val="accent4"/>
-                        </a:effectRef>
-                        <a:fontRef idx="minor">
-                          <a:schemeClr val="tx1"/>
-                        </a:fontRef>
-                      </wps:style>
-                      <wps:bodyPr/>
-                    </wps:wsp>
-                  </a:graphicData>
-                </a:graphic>
-                <wp14:sizeRelH relativeFrom="margin">
-                  <wp14:pctWidth>0</wp14:pctWidth>
-                </wp14:sizeRelH>
-                <wp14:sizeRelV relativeFrom="margin">
-                  <wp14:pctHeight>0</wp14:pctHeight>
-                </wp14:sizeRelV>
-              </wp:anchor>
-            </w:drawing>
-          </mc:Choice>
-          <mc:Fallback>
-            <w:pict>
-              <v:line w14:anchorId="3E913623" id="Straight Connector 1" o:spid="_x0000_s1026" style="position:absolute;z-index:251663360;visibility:visible;mso-wrap-style:square;mso-width-percent:0;mso-height-percent:0;mso-wrap-distance-left:9pt;mso-wrap-distance-top:0;mso-wrap-distance-right:9pt;mso-wrap-distance-bottom:0;mso-position-horizontal:absolute;mso-position-horizontal-relative:text;mso-position-vertical:absolute;mso-position-vertical-relative:text;mso-width-percent:0;mso-height-percent:0;mso-width-relative:margin;mso-height-relative:margin" from="-21.35pt,19.6pt" to="530.65pt,19.6pt" o:gfxdata="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" strokecolor="#ffc000 [3207]" strokeweight="2.25pt">
-                <v:stroke joinstyle="miter"/>
-              </v:line>
-            </w:pict>
-          </mc:Fallback>
-        </mc:AlternateContent>
       </w:r>
       <w:r>
         <w:rPr>
@@ -3762,71 +3564,6 @@
           <w:szCs w:val="20"/>
           <w:u w:val="none"/>
         </w:rPr>
-        <mc:AlternateContent>
-          <mc:Choice Requires="wps">
-            <w:drawing>
-              <wp:anchor distT="0" distB="0" distL="114300" distR="114300" simplePos="0" relativeHeight="251665408" behindDoc="0" locked="0" layoutInCell="1" allowOverlap="1" wp14:anchorId="0C24A44D" wp14:editId="487A15EE">
-                <wp:simplePos x="0" y="0"/>
-                <wp:positionH relativeFrom="column">
-                  <wp:posOffset>-271145</wp:posOffset>
-                </wp:positionH>
-                <wp:positionV relativeFrom="paragraph">
-                  <wp:posOffset>258445</wp:posOffset>
-                </wp:positionV>
-                <wp:extent cx="7010400" cy="0"/>
-                <wp:effectExtent l="0" t="19050" r="19050" b="19050"/>
-                <wp:wrapNone/>
-                <wp:docPr id="2145409809" name="Straight Connector 1"/>
-                <wp:cNvGraphicFramePr/>
-                <a:graphic xmlns:a="http://schemas.openxmlformats.org/drawingml/2006/main">
-                  <a:graphicData uri="http://schemas.microsoft.com/office/word/2010/wordprocessingShape">
-                    <wps:wsp>
-                      <wps:cNvCnPr/>
-                      <wps:spPr>
-                        <a:xfrm>
-                          <a:off x="0" y="0"/>
-                          <a:ext cx="7010400" cy="0"/>
-                        </a:xfrm>
-                        <a:prstGeom prst="line">
-                          <a:avLst/>
-                        </a:prstGeom>
-                        <a:ln w="28575"/>
-                      </wps:spPr>
-                      <wps:style>
-                        <a:lnRef idx="3">
-                          <a:schemeClr val="accent4"/>
-                        </a:lnRef>
-                        <a:fillRef idx="0">
-                          <a:schemeClr val="accent4"/>
-                        </a:fillRef>
-                        <a:effectRef idx="2">
-                          <a:schemeClr val="accent4"/>
-                        </a:effectRef>
-                        <a:fontRef idx="minor">
-                          <a:schemeClr val="tx1"/>
-                        </a:fontRef>
-                      </wps:style>
-                      <wps:bodyPr/>
-                    </wps:wsp>
-                  </a:graphicData>
-                </a:graphic>
-                <wp14:sizeRelH relativeFrom="margin">
-                  <wp14:pctWidth>0</wp14:pctWidth>
-                </wp14:sizeRelH>
-                <wp14:sizeRelV relativeFrom="margin">
-                  <wp14:pctHeight>0</wp14:pctHeight>
-                </wp14:sizeRelV>
-              </wp:anchor>
-            </w:drawing>
-          </mc:Choice>
-          <mc:Fallback>
-            <w:pict>
-              <v:line w14:anchorId="30E519C4" id="Straight Connector 1" o:spid="_x0000_s1026" style="position:absolute;z-index:251665408;visibility:visible;mso-wrap-style:square;mso-width-percent:0;mso-height-percent:0;mso-wrap-distance-left:9pt;mso-wrap-distance-top:0;mso-wrap-distance-right:9pt;mso-wrap-distance-bottom:0;mso-position-horizontal:absolute;mso-position-horizontal-relative:text;mso-position-vertical:absolute;mso-position-vertical-relative:text;mso-width-percent:0;mso-height-percent:0;mso-width-relative:margin;mso-height-relative:margin" from="-21.35pt,20.35pt" to="530.65pt,20.35pt" o:gfxdata="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" strokecolor="#ffc000 [3207]" strokeweight="2.25pt">
-                <v:stroke joinstyle="miter"/>
-              </v:line>
-            </w:pict>
-          </mc:Fallback>
-        </mc:AlternateContent>
       </w:r>
       <w:r>
         <w:rPr>
@@ -4523,71 +4260,6 @@
           <w:szCs w:val="20"/>
           <w:u w:val="none"/>
         </w:rPr>
-        <mc:AlternateContent>
-          <mc:Choice Requires="wps">
-            <w:drawing>
-              <wp:anchor distT="0" distB="0" distL="114300" distR="114300" simplePos="0" relativeHeight="251667456" behindDoc="0" locked="0" layoutInCell="1" allowOverlap="1" wp14:anchorId="1E106983" wp14:editId="73863B69">
-                <wp:simplePos x="0" y="0"/>
-                <wp:positionH relativeFrom="column">
-                  <wp:posOffset>-271145</wp:posOffset>
-                </wp:positionH>
-                <wp:positionV relativeFrom="paragraph">
-                  <wp:posOffset>267970</wp:posOffset>
-                </wp:positionV>
-                <wp:extent cx="7010400" cy="0"/>
-                <wp:effectExtent l="0" t="19050" r="19050" b="19050"/>
-                <wp:wrapNone/>
-                <wp:docPr id="110125138" name="Straight Connector 1"/>
-                <wp:cNvGraphicFramePr/>
-                <a:graphic xmlns:a="http://schemas.openxmlformats.org/drawingml/2006/main">
-                  <a:graphicData uri="http://schemas.microsoft.com/office/word/2010/wordprocessingShape">
-                    <wps:wsp>
-                      <wps:cNvCnPr/>
-                      <wps:spPr>
-                        <a:xfrm>
-                          <a:off x="0" y="0"/>
-                          <a:ext cx="7010400" cy="0"/>
-                        </a:xfrm>
-                        <a:prstGeom prst="line">
-                          <a:avLst/>
-                        </a:prstGeom>
-                        <a:ln w="28575"/>
-                      </wps:spPr>
-                      <wps:style>
-                        <a:lnRef idx="3">
-                          <a:schemeClr val="accent4"/>
-                        </a:lnRef>
-                        <a:fillRef idx="0">
-                          <a:schemeClr val="accent4"/>
-                        </a:fillRef>
-                        <a:effectRef idx="2">
-                          <a:schemeClr val="accent4"/>
-                        </a:effectRef>
-                        <a:fontRef idx="minor">
-                          <a:schemeClr val="tx1"/>
-                        </a:fontRef>
-                      </wps:style>
-                      <wps:bodyPr/>
-                    </wps:wsp>
-                  </a:graphicData>
-                </a:graphic>
-                <wp14:sizeRelH relativeFrom="margin">
-                  <wp14:pctWidth>0</wp14:pctWidth>
-                </wp14:sizeRelH>
-                <wp14:sizeRelV relativeFrom="margin">
-                  <wp14:pctHeight>0</wp14:pctHeight>
-                </wp14:sizeRelV>
-              </wp:anchor>
-            </w:drawing>
-          </mc:Choice>
-          <mc:Fallback>
-            <w:pict>
-              <v:line w14:anchorId="64870373" id="Straight Connector 1" o:spid="_x0000_s1026" style="position:absolute;z-index:251667456;visibility:visible;mso-wrap-style:square;mso-width-percent:0;mso-height-percent:0;mso-wrap-distance-left:9pt;mso-wrap-distance-top:0;mso-wrap-distance-right:9pt;mso-wrap-distance-bottom:0;mso-position-horizontal:absolute;mso-position-horizontal-relative:text;mso-position-vertical:absolute;mso-position-vertical-relative:text;mso-width-percent:0;mso-height-percent:0;mso-width-relative:margin;mso-height-relative:margin" from="-21.35pt,21.1pt" to="530.65pt,21.1pt" o:gfxdata="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" strokecolor="#ffc000 [3207]" strokeweight="2.25pt">
-                <v:stroke joinstyle="miter"/>
-              </v:line>
-            </w:pict>
-          </mc:Fallback>
-        </mc:AlternateContent>
       </w:r>
       <w:r>
         <w:rPr>
@@ -4703,71 +4375,6 @@
           <w:szCs w:val="20"/>
           <w:u w:val="none"/>
         </w:rPr>
-        <mc:AlternateContent>
-          <mc:Choice Requires="wps">
-            <w:drawing>
-              <wp:anchor distT="0" distB="0" distL="114300" distR="114300" simplePos="0" relativeHeight="251669504" behindDoc="0" locked="0" layoutInCell="1" allowOverlap="1" wp14:anchorId="4439B4E7" wp14:editId="71B412E7">
-                <wp:simplePos x="0" y="0"/>
-                <wp:positionH relativeFrom="column">
-                  <wp:posOffset>-271145</wp:posOffset>
-                </wp:positionH>
-                <wp:positionV relativeFrom="paragraph">
-                  <wp:posOffset>248920</wp:posOffset>
-                </wp:positionV>
-                <wp:extent cx="7010400" cy="0"/>
-                <wp:effectExtent l="0" t="19050" r="19050" b="19050"/>
-                <wp:wrapNone/>
-                <wp:docPr id="433850156" name="Straight Connector 1"/>
-                <wp:cNvGraphicFramePr/>
-                <a:graphic xmlns:a="http://schemas.openxmlformats.org/drawingml/2006/main">
-                  <a:graphicData uri="http://schemas.microsoft.com/office/word/2010/wordprocessingShape">
-                    <wps:wsp>
-                      <wps:cNvCnPr/>
-                      <wps:spPr>
-                        <a:xfrm>
-                          <a:off x="0" y="0"/>
-                          <a:ext cx="7010400" cy="0"/>
-                        </a:xfrm>
-                        <a:prstGeom prst="line">
-                          <a:avLst/>
-                        </a:prstGeom>
-                        <a:ln w="28575"/>
-                      </wps:spPr>
-                      <wps:style>
-                        <a:lnRef idx="3">
-                          <a:schemeClr val="accent4"/>
-                        </a:lnRef>
-                        <a:fillRef idx="0">
-                          <a:schemeClr val="accent4"/>
-                        </a:fillRef>
-                        <a:effectRef idx="2">
-                          <a:schemeClr val="accent4"/>
-                        </a:effectRef>
-                        <a:fontRef idx="minor">
-                          <a:schemeClr val="tx1"/>
-                        </a:fontRef>
-                      </wps:style>
-                      <wps:bodyPr/>
-                    </wps:wsp>
-                  </a:graphicData>
-                </a:graphic>
-                <wp14:sizeRelH relativeFrom="margin">
-                  <wp14:pctWidth>0</wp14:pctWidth>
-                </wp14:sizeRelH>
-                <wp14:sizeRelV relativeFrom="margin">
-                  <wp14:pctHeight>0</wp14:pctHeight>
-                </wp14:sizeRelV>
-              </wp:anchor>
-            </w:drawing>
-          </mc:Choice>
-          <mc:Fallback>
-            <w:pict>
-              <v:line w14:anchorId="6E074540" id="Straight Connector 1" o:spid="_x0000_s1026" style="position:absolute;z-index:251669504;visibility:visible;mso-wrap-style:square;mso-width-percent:0;mso-height-percent:0;mso-wrap-distance-left:9pt;mso-wrap-distance-top:0;mso-wrap-distance-right:9pt;mso-wrap-distance-bottom:0;mso-position-horizontal:absolute;mso-position-horizontal-relative:text;mso-position-vertical:absolute;mso-position-vertical-relative:text;mso-width-percent:0;mso-height-percent:0;mso-width-relative:margin;mso-height-relative:margin" from="-21.35pt,19.6pt" to="530.65pt,19.6pt" o:gfxdata="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" strokecolor="#ffc000 [3207]" strokeweight="2.25pt">
-                <v:stroke joinstyle="miter"/>
-              </v:line>
-            </w:pict>
-          </mc:Fallback>
-        </mc:AlternateContent>
       </w:r>
       <w:r>
         <w:rPr>

</xml_diff>

<commit_message>
fix(template): one photo per row with name/description; stop table right-shift
Photos:
- Restructure the docx image loop into one image per paragraph with bold
  {name} and {description} caption paragraphs beneath (centred). Plumb the
  photo name + description through ServiceLocater -> buildData. Image size
  back up to ~430px for a single-column layout.

Tables:
- Tables 1-3 had no explicit tblInd, so the converter added its own default
  indent and pushed them right. Add tblInd=0 + left justification to the
  tables that lacked it (all 4 now anchored to the left margin).

Verified: well-formed XML, tags intact, clean 200/PDF convert round-trip.
</commit_message>
<xml_diff>
--- a/public/templates/service-location.docx
+++ b/public/templates/service-location.docx
@@ -33,6 +33,8 @@
       <w:tblPr>
         <w:tblStyle w:val="ListTable4-Accent4"/>
         <w:tblW w:w="10940" w:type="dxa"/>
+        <w:jc w:val="left"/>
+        <w:tblInd w:w="0" w:type="dxa"/>
         <w:tblLook w:val="04A0" w:firstRow="1" w:lastRow="0" w:firstColumn="1" w:lastColumn="0" w:noHBand="0" w:noVBand="1"/>
       </w:tblPr>
       <w:tblGrid>
@@ -625,6 +627,8 @@
     <w:tbl>
       <w:tblPr>
         <w:tblW w:w="5453" w:type="pct"/>
+        <w:jc w:val="left"/>
+        <w:tblInd w:w="0" w:type="dxa"/>
         <w:tblCellMar>
           <w:left w:w="0" w:type="dxa"/>
           <w:right w:w="0" w:type="dxa"/>
@@ -2793,6 +2797,8 @@
       <w:tblPr>
         <w:tblStyle w:val="ListTable4-Accent4"/>
         <w:tblW w:w="10912" w:type="dxa"/>
+        <w:jc w:val="left"/>
+        <w:tblInd w:w="0" w:type="dxa"/>
         <w:tblLook w:val="04A0" w:firstRow="1" w:lastRow="0" w:firstColumn="1" w:lastColumn="0" w:noHBand="0" w:noVBand="1"/>
       </w:tblPr>
       <w:tblGrid>
@@ -4302,27 +4308,41 @@
     </w:p>
     <w:p>
       <w:pPr>
-        <w:pStyle w:val="Style1"/>
-        <w:ind w:left="-142" w:hanging="284"/>
-        <w:rPr>
-          <w:sz w:val="28"/>
-          <w:szCs w:val="20"/>
-          <w:u w:val="none"/>
-        </w:rPr>
-      </w:pPr>
-      <w:r>
-        <w:rPr>
-          <w:sz w:val="28"/>
-          <w:szCs w:val="20"/>
-          <w:u w:val="none"/>
-        </w:rPr>
+        <w:jc w:val="center"/>
+        <w:spacing w:before="120"/>
+      </w:pPr>
+      <w:r>
         <w:t>{#photos}</w:t>
       </w:r>
       <w:r>
         <w:t xml:space="preserve">{%data}</w:t>
       </w:r>
-      <w:r>
-        <w:t xml:space="preserve">{/photos}</w:t>
+    </w:p>
+    <w:p>
+      <w:pPr>
+        <w:jc w:val="center"/>
+      </w:pPr>
+      <w:r>
+        <w:rPr>
+          <w:b/>
+          <w:sz w:val="22"/>
+        </w:rPr>
+        <w:t xml:space="preserve">{name}</w:t>
+      </w:r>
+    </w:p>
+    <w:p>
+      <w:pPr>
+        <w:jc w:val="center"/>
+        <w:spacing w:after="200"/>
+      </w:pPr>
+      <w:r>
+        <w:rPr>
+          <w:sz w:val="20"/>
+        </w:rPr>
+        <w:t xml:space="preserve">{description}</w:t>
+      </w:r>
+      <w:r>
+        <w:t>{/photos}</w:t>
       </w:r>
     </w:p>
     <w:p>

</xml_diff>

<commit_message>
fix(template): align headings to margin (table shift) + robust photo captions
- Section headings hung ~0.3in into the left margin (left=-142 hanging=284),
  which the converter honours while tables sit at the margin (tblInd=0) and
  negative table indents get clamped -- so tables looked shifted right.
  Zero the 9 heading indents so headings and tables line up at the margin.
- Photo loop is now a single paragraph (image + line-break + {name} +
  {description}) so the captions are unambiguously inside the loop scope.

Verified: well-formed XML, tags intact, clean PDF convert round-trip.
</commit_message>
<xml_diff>
--- a/public/templates/service-location.docx
+++ b/public/templates/service-location.docx
@@ -589,7 +589,7 @@
     <w:p>
       <w:pPr>
         <w:pStyle w:val="Style1"/>
-        <w:ind w:left="-142" w:hanging="284"/>
+        <w:ind w:left="0"/>
         <w:rPr>
           <w:sz w:val="28"/>
           <w:szCs w:val="20"/>
@@ -2732,7 +2732,7 @@
     <w:p>
       <w:pPr>
         <w:pStyle w:val="Style1"/>
-        <w:ind w:left="-142" w:hanging="284"/>
+        <w:ind w:left="0"/>
         <w:rPr>
           <w:sz w:val="28"/>
           <w:szCs w:val="20"/>
@@ -3235,7 +3235,7 @@
     <w:p>
       <w:pPr>
         <w:pStyle w:val="Style1"/>
-        <w:ind w:left="-142" w:hanging="284"/>
+        <w:ind w:left="0"/>
         <w:rPr>
           <w:sz w:val="28"/>
           <w:szCs w:val="20"/>
@@ -3262,7 +3262,7 @@
     <w:p>
       <w:pPr>
         <w:pStyle w:val="Style1"/>
-        <w:ind w:left="-142" w:hanging="284"/>
+        <w:ind w:left="0"/>
         <w:rPr>
           <w:sz w:val="22"/>
           <w:szCs w:val="16"/>
@@ -3556,7 +3556,7 @@
     <w:p>
       <w:pPr>
         <w:pStyle w:val="Style1"/>
-        <w:ind w:left="-142" w:hanging="284"/>
+        <w:ind w:left="0"/>
         <w:rPr>
           <w:sz w:val="28"/>
           <w:szCs w:val="20"/>
@@ -4287,7 +4287,7 @@
     <w:p>
       <w:pPr>
         <w:pStyle w:val="Style1"/>
-        <w:ind w:left="-142" w:hanging="284"/>
+        <w:ind w:left="0"/>
         <w:rPr>
           <w:sz w:val="28"/>
           <w:szCs w:val="20"/>
@@ -4298,7 +4298,7 @@
     <w:p>
       <w:pPr>
         <w:pStyle w:val="Style1"/>
-        <w:ind w:left="-142" w:hanging="284"/>
+        <w:ind w:left="0"/>
         <w:rPr>
           <w:sz w:val="28"/>
           <w:szCs w:val="20"/>
@@ -4309,7 +4309,7 @@
     <w:p>
       <w:pPr>
         <w:jc w:val="center"/>
-        <w:spacing w:before="120"/>
+        <w:spacing w:before="160" w:after="160"/>
       </w:pPr>
       <w:r>
         <w:t>{#photos}</w:t>
@@ -4317,11 +4317,9 @@
       <w:r>
         <w:t xml:space="preserve">{%data}</w:t>
       </w:r>
-    </w:p>
-    <w:p>
-      <w:pPr>
-        <w:jc w:val="center"/>
-      </w:pPr>
+      <w:r>
+        <w:br/>
+      </w:r>
       <w:r>
         <w:rPr>
           <w:b/>
@@ -4329,12 +4327,9 @@
         </w:rPr>
         <w:t xml:space="preserve">{name}</w:t>
       </w:r>
-    </w:p>
-    <w:p>
-      <w:pPr>
-        <w:jc w:val="center"/>
-        <w:spacing w:after="200"/>
-      </w:pPr>
+      <w:r>
+        <w:br/>
+      </w:r>
       <w:r>
         <w:rPr>
           <w:sz w:val="20"/>
@@ -4342,13 +4337,19 @@
         <w:t xml:space="preserve">{description}</w:t>
       </w:r>
       <w:r>
+        <w:br/>
+      </w:r>
+      <w:r>
+        <w:br/>
+      </w:r>
+      <w:r>
         <w:t>{/photos}</w:t>
       </w:r>
     </w:p>
     <w:p>
       <w:pPr>
         <w:pStyle w:val="Style1"/>
-        <w:ind w:left="-142" w:hanging="284"/>
+        <w:ind w:left="0"/>
         <w:rPr>
           <w:sz w:val="28"/>
           <w:szCs w:val="20"/>
@@ -4381,7 +4382,7 @@
     <w:p>
       <w:pPr>
         <w:pStyle w:val="Style1"/>
-        <w:ind w:left="-142" w:hanging="284"/>
+        <w:ind w:left="0"/>
         <w:rPr>
           <w:sz w:val="28"/>
           <w:szCs w:val="20"/>

</xml_diff>

<commit_message>
style(template): colour the Service Location asset cells by utility
Fill each checklist asset cell with its utility colour (matched exactly to
the original ES template): Gas FDF483, Sewer FBE4D5, Stormwater 92D050,
SAPN/Traffic/Street F4B083, Water 8EAADB, Fire Main C45911 (white text),
Reclaimed D777C5, Unknown FF3399; Telecommunications/Optic left white.
Verified by rendering the template to PDF.
</commit_message>
<xml_diff>
--- a/public/templates/service-location.docx
+++ b/public/templates/service-location.docx
@@ -665,6 +665,7 @@
         <w:tc>
           <w:tcPr>
             <w:tcW w:w="3400" w:type="dxa"/>
+            <w:shd w:val="clear" w:color="auto" w:fill="FDF483"/>
             <w:tcMar>
               <w:top w:w="40" w:type="dxa"/>
               <w:left w:w="110" w:type="dxa"/>
@@ -760,7 +761,7 @@
         <w:tc>
           <w:tcPr>
             <w:tcW w:w="3400" w:type="dxa"/>
-            <w:shd w:val="clear" w:color="auto" w:fill="FBF6E9"/>
+            <w:shd w:val="clear" w:color="auto" w:fill="FBE4D5"/>
             <w:tcMar>
               <w:top w:w="40" w:type="dxa"/>
               <w:left w:w="110" w:type="dxa"/>
@@ -793,7 +794,6 @@
         <w:tc>
           <w:tcPr>
             <w:tcW w:w="1700" w:type="dxa"/>
-            <w:shd w:val="clear" w:color="auto" w:fill="FBF6E9"/>
             <w:tcMar>
               <w:top w:w="40" w:type="dxa"/>
               <w:left w:w="110" w:type="dxa"/>
@@ -825,7 +825,6 @@
         <w:tc>
           <w:tcPr>
             <w:tcW w:w="4986" w:type="dxa"/>
-            <w:shd w:val="clear" w:color="auto" w:fill="FBF6E9"/>
             <w:tcMar>
               <w:top w:w="40" w:type="dxa"/>
               <w:left w:w="110" w:type="dxa"/>
@@ -858,6 +857,7 @@
         <w:tc>
           <w:tcPr>
             <w:tcW w:w="3400" w:type="dxa"/>
+            <w:shd w:val="clear" w:color="auto" w:fill="92D050"/>
             <w:tcMar>
               <w:top w:w="40" w:type="dxa"/>
               <w:left w:w="110" w:type="dxa"/>
@@ -953,7 +953,6 @@
         <w:tc>
           <w:tcPr>
             <w:tcW w:w="3400" w:type="dxa"/>
-            <w:shd w:val="clear" w:color="auto" w:fill="FBF6E9"/>
             <w:tcMar>
               <w:top w:w="40" w:type="dxa"/>
               <w:left w:w="110" w:type="dxa"/>
@@ -986,7 +985,6 @@
         <w:tc>
           <w:tcPr>
             <w:tcW w:w="1700" w:type="dxa"/>
-            <w:shd w:val="clear" w:color="auto" w:fill="FBF6E9"/>
             <w:tcMar>
               <w:top w:w="40" w:type="dxa"/>
               <w:left w:w="110" w:type="dxa"/>
@@ -1018,7 +1016,6 @@
         <w:tc>
           <w:tcPr>
             <w:tcW w:w="4986" w:type="dxa"/>
-            <w:shd w:val="clear" w:color="auto" w:fill="FBF6E9"/>
             <w:tcMar>
               <w:top w:w="40" w:type="dxa"/>
               <w:left w:w="110" w:type="dxa"/>
@@ -1051,6 +1048,7 @@
         <w:tc>
           <w:tcPr>
             <w:tcW w:w="3400" w:type="dxa"/>
+            <w:shd w:val="clear" w:color="auto" w:fill="F4B083"/>
             <w:tcMar>
               <w:top w:w="40" w:type="dxa"/>
               <w:left w:w="110" w:type="dxa"/>
@@ -1146,7 +1144,7 @@
         <w:tc>
           <w:tcPr>
             <w:tcW w:w="3400" w:type="dxa"/>
-            <w:shd w:val="clear" w:color="auto" w:fill="FBF6E9"/>
+            <w:shd w:val="clear" w:color="auto" w:fill="F4B083"/>
             <w:tcMar>
               <w:top w:w="40" w:type="dxa"/>
               <w:left w:w="110" w:type="dxa"/>
@@ -1179,7 +1177,6 @@
         <w:tc>
           <w:tcPr>
             <w:tcW w:w="1700" w:type="dxa"/>
-            <w:shd w:val="clear" w:color="auto" w:fill="FBF6E9"/>
             <w:tcMar>
               <w:top w:w="40" w:type="dxa"/>
               <w:left w:w="110" w:type="dxa"/>
@@ -1211,7 +1208,6 @@
         <w:tc>
           <w:tcPr>
             <w:tcW w:w="4986" w:type="dxa"/>
-            <w:shd w:val="clear" w:color="auto" w:fill="FBF6E9"/>
             <w:tcMar>
               <w:top w:w="40" w:type="dxa"/>
               <w:left w:w="110" w:type="dxa"/>
@@ -1244,6 +1240,7 @@
         <w:tc>
           <w:tcPr>
             <w:tcW w:w="3400" w:type="dxa"/>
+            <w:shd w:val="clear" w:color="auto" w:fill="F4B083"/>
             <w:tcMar>
               <w:top w:w="40" w:type="dxa"/>
               <w:left w:w="110" w:type="dxa"/>
@@ -1339,7 +1336,7 @@
         <w:tc>
           <w:tcPr>
             <w:tcW w:w="3400" w:type="dxa"/>
-            <w:shd w:val="clear" w:color="auto" w:fill="FBF6E9"/>
+            <w:shd w:val="clear" w:color="auto" w:fill="8EAADB"/>
             <w:tcMar>
               <w:top w:w="40" w:type="dxa"/>
               <w:left w:w="110" w:type="dxa"/>
@@ -1372,7 +1369,6 @@
         <w:tc>
           <w:tcPr>
             <w:tcW w:w="1700" w:type="dxa"/>
-            <w:shd w:val="clear" w:color="auto" w:fill="FBF6E9"/>
             <w:tcMar>
               <w:top w:w="40" w:type="dxa"/>
               <w:left w:w="110" w:type="dxa"/>
@@ -1404,7 +1400,6 @@
         <w:tc>
           <w:tcPr>
             <w:tcW w:w="4986" w:type="dxa"/>
-            <w:shd w:val="clear" w:color="auto" w:fill="FBF6E9"/>
             <w:tcMar>
               <w:top w:w="40" w:type="dxa"/>
               <w:left w:w="110" w:type="dxa"/>
@@ -1437,30 +1432,31 @@
         <w:tc>
           <w:tcPr>
             <w:tcW w:w="3400" w:type="dxa"/>
-            <w:tcMar>
-              <w:top w:w="40" w:type="dxa"/>
-              <w:left w:w="110" w:type="dxa"/>
-              <w:bottom w:w="40" w:type="dxa"/>
-              <w:right w:w="110" w:type="dxa"/>
-            </w:tcMar>
-            <w:vAlign w:val="center"/>
-          </w:tcPr>
-          <w:p>
-            <w:pPr>
-              <w:spacing w:after="0" w:line="240" w:lineRule="auto"/>
-              <w:rPr>
-                <w:sz w:val="20"/>
-                <w:szCs w:val="20"/>
-                <w:b/>
-                <w:color w:val="130C0E"/>
-              </w:rPr>
-            </w:pPr>
-            <w:r>
-              <w:rPr>
-                <w:sz w:val="20"/>
-                <w:szCs w:val="20"/>
-                <w:b/>
-                <w:color w:val="130C0E"/>
+            <w:shd w:val="clear" w:color="auto" w:fill="C45911"/>
+            <w:tcMar>
+              <w:top w:w="40" w:type="dxa"/>
+              <w:left w:w="110" w:type="dxa"/>
+              <w:bottom w:w="40" w:type="dxa"/>
+              <w:right w:w="110" w:type="dxa"/>
+            </w:tcMar>
+            <w:vAlign w:val="center"/>
+          </w:tcPr>
+          <w:p>
+            <w:pPr>
+              <w:spacing w:after="0" w:line="240" w:lineRule="auto"/>
+              <w:rPr>
+                <w:sz w:val="20"/>
+                <w:szCs w:val="20"/>
+                <w:b/>
+                <w:color w:val="FFFFFF"/>
+              </w:rPr>
+            </w:pPr>
+            <w:r>
+              <w:rPr>
+                <w:sz w:val="20"/>
+                <w:szCs w:val="20"/>
+                <w:b/>
+                <w:color w:val="FFFFFF"/>
               </w:rPr>
               <w:t xml:space="preserve">Fire Main</w:t>
             </w:r>
@@ -1532,7 +1528,6 @@
         <w:tc>
           <w:tcPr>
             <w:tcW w:w="3400" w:type="dxa"/>
-            <w:shd w:val="clear" w:color="auto" w:fill="FBF6E9"/>
             <w:tcMar>
               <w:top w:w="40" w:type="dxa"/>
               <w:left w:w="110" w:type="dxa"/>
@@ -1565,7 +1560,6 @@
         <w:tc>
           <w:tcPr>
             <w:tcW w:w="1700" w:type="dxa"/>
-            <w:shd w:val="clear" w:color="auto" w:fill="FBF6E9"/>
             <w:tcMar>
               <w:top w:w="40" w:type="dxa"/>
               <w:left w:w="110" w:type="dxa"/>
@@ -1597,7 +1591,6 @@
         <w:tc>
           <w:tcPr>
             <w:tcW w:w="4986" w:type="dxa"/>
-            <w:shd w:val="clear" w:color="auto" w:fill="FBF6E9"/>
             <w:tcMar>
               <w:top w:w="40" w:type="dxa"/>
               <w:left w:w="110" w:type="dxa"/>
@@ -1630,6 +1623,7 @@
         <w:tc>
           <w:tcPr>
             <w:tcW w:w="3400" w:type="dxa"/>
+            <w:shd w:val="clear" w:color="auto" w:fill="D777C5"/>
             <w:tcMar>
               <w:top w:w="40" w:type="dxa"/>
               <w:left w:w="110" w:type="dxa"/>
@@ -1725,7 +1719,7 @@
         <w:tc>
           <w:tcPr>
             <w:tcW w:w="3400" w:type="dxa"/>
-            <w:shd w:val="clear" w:color="auto" w:fill="FBF6E9"/>
+            <w:shd w:val="clear" w:color="auto" w:fill="FF3399"/>
             <w:tcMar>
               <w:top w:w="40" w:type="dxa"/>
               <w:left w:w="110" w:type="dxa"/>
@@ -1758,7 +1752,6 @@
         <w:tc>
           <w:tcPr>
             <w:tcW w:w="1700" w:type="dxa"/>
-            <w:shd w:val="clear" w:color="auto" w:fill="FBF6E9"/>
             <w:tcMar>
               <w:top w:w="40" w:type="dxa"/>
               <w:left w:w="110" w:type="dxa"/>
@@ -1790,7 +1783,6 @@
         <w:tc>
           <w:tcPr>
             <w:tcW w:w="4986" w:type="dxa"/>
-            <w:shd w:val="clear" w:color="auto" w:fill="FBF6E9"/>
             <w:tcMar>
               <w:top w:w="40" w:type="dxa"/>
               <w:left w:w="110" w:type="dxa"/>

</xml_diff>